<commit_message>
Week 5/6: weekly report, filled Reproduction_Log.xlsx, comparison table vs paper
Co-Authored-By: Claude Opus 5 <noreply@anthropic.com>
</commit_message>
<xml_diff>
--- a/docs/weekly-reports/Week 2/Weekly_Report.docx
+++ b/docs/weekly-reports/Week 2/Weekly_Report.docx
@@ -38,8 +38,7 @@
     </w:p>
     <w:p>
       <w:pPr>
-        <w:ind w:left="7200" w:firstLine="720"/>
-        <w:jc w:val="center"/>
+        <w:jc w:val="right"/>
         <w:rPr>
           <w:rFonts w:ascii="Times New Roman" w:hAnsi="Times New Roman" w:cs="Times New Roman"/>
           <w:b/>
@@ -52,93 +51,93 @@
           <w:b/>
           <w:bCs/>
         </w:rPr>
-        <w:t>Date:</w:t>
-      </w:r>
-      <w:r>
+        <w:t>Date: 15 August 2026</w:t>
+      </w:r>
+    </w:p>
+    <w:p>
+      <w:pPr>
         <w:rPr>
           <w:rFonts w:ascii="Times New Roman" w:hAnsi="Times New Roman" w:cs="Times New Roman"/>
           <w:b/>
           <w:bCs/>
         </w:rPr>
-        <w:t xml:space="preserve"> 15 August 2026</w:t>
-      </w:r>
-    </w:p>
-    <w:p>
-      <w:pPr>
+      </w:pPr>
+      <w:r>
         <w:rPr>
           <w:rFonts w:ascii="Times New Roman" w:hAnsi="Times New Roman" w:cs="Times New Roman"/>
           <w:b/>
           <w:bCs/>
         </w:rPr>
-      </w:pPr>
-      <w:r>
+        <w:t>Team Number: 21</w:t>
+      </w:r>
+    </w:p>
+    <w:p>
+      <w:pPr>
         <w:rPr>
           <w:rFonts w:ascii="Times New Roman" w:hAnsi="Times New Roman" w:cs="Times New Roman"/>
           <w:b/>
           <w:bCs/>
         </w:rPr>
-        <w:t>Team Number:</w:t>
-        <w:tab/>
-        <w:tab/>
-        <w:tab/>
-        <w:tab/>
-        <w:tab/>
-        <w:tab/>
-        <w:tab/>
-      </w:r>
+      </w:pPr>
       <w:r>
         <w:rPr>
           <w:rFonts w:ascii="Times New Roman" w:hAnsi="Times New Roman" w:cs="Times New Roman"/>
           <w:b/>
           <w:bCs/>
         </w:rPr>
-        <w:t xml:space="preserve"> 21</w:t>
-      </w:r>
-    </w:p>
-    <w:p>
-      <w:pPr>
+        <w:t>ID #: 2320090050, 2320090009</w:t>
+      </w:r>
+    </w:p>
+    <w:p>
+      <w:pPr>
+        <w:rPr>
+          <w:rFonts w:ascii="Times New Roman" w:hAnsi="Times New Roman" w:cs="Times New Roman"/>
+        </w:rPr>
+      </w:pPr>
+      <w:r>
         <w:rPr>
           <w:rFonts w:ascii="Times New Roman" w:hAnsi="Times New Roman" w:cs="Times New Roman"/>
           <w:b/>
           <w:bCs/>
         </w:rPr>
-      </w:pPr>
+        <w:t>Project Title</w:t>
+      </w:r>
+      <w:r>
+        <w:rPr>
+          <w:rFonts w:ascii="Times New Roman" w:hAnsi="Times New Roman" w:cs="Times New Roman"/>
+        </w:rPr>
+        <w:t xml:space="preserve">: </w:t>
+      </w:r>
       <w:r>
         <w:rPr>
           <w:rFonts w:ascii="Times New Roman" w:hAnsi="Times New Roman" w:cs="Times New Roman"/>
           <w:b/>
           <w:bCs/>
         </w:rPr>
-        <w:t xml:space="preserve">ID #: </w:t>
-      </w:r>
+        <w:t>QueryGenie: A Self-Correcting Natural Language to SQL Interface</w:t>
+      </w:r>
+    </w:p>
+    <w:p>
+      <w:pPr>
+        <w:rPr>
+          <w:rFonts w:ascii="Times New Roman" w:hAnsi="Times New Roman" w:cs="Times New Roman"/>
+        </w:rPr>
+      </w:pPr>
       <w:r>
         <w:rPr>
           <w:rFonts w:ascii="Times New Roman" w:hAnsi="Times New Roman" w:cs="Times New Roman"/>
           <w:b/>
           <w:bCs/>
         </w:rPr>
-        <w:t xml:space="preserve">2320090050, 2320090009</w:t>
-      </w:r>
-    </w:p>
-    <w:p>
-      <w:pPr>
-        <w:rPr>
-          <w:rFonts w:ascii="Times New Roman" w:hAnsi="Times New Roman" w:cs="Times New Roman"/>
-        </w:rPr>
-      </w:pPr>
+        <w:t xml:space="preserve">Week </w:t>
+      </w:r>
       <w:r>
         <w:rPr>
           <w:rFonts w:ascii="Times New Roman" w:hAnsi="Times New Roman" w:cs="Times New Roman"/>
           <w:b/>
           <w:bCs/>
         </w:rPr>
-        <w:t xml:space="preserve">Project Title</w:t>
-      </w:r>
-      <w:r>
-        <w:rPr>
-          <w:rFonts w:ascii="Times New Roman" w:hAnsi="Times New Roman" w:cs="Times New Roman"/>
-        </w:rPr>
-        <w:t xml:space="preserve">: </w:t>
+        <w:t>:</w:t>
       </w:r>
       <w:r>
         <w:rPr>
@@ -146,7 +145,7 @@
           <w:b/>
           <w:bCs/>
         </w:rPr>
-        <w:t xml:space="preserve">QueryGenie: A Self-Correcting Natural Language to SQL Interface</w:t>
+        <w:t>2 of 16</w:t>
       </w:r>
     </w:p>
     <w:p>
@@ -161,36 +160,7 @@
           <w:b/>
           <w:bCs/>
         </w:rPr>
-        <w:t xml:space="preserve">Week (X of 16)</w:t>
-      </w:r>
-      <w:r>
-        <w:rPr>
-          <w:rFonts w:ascii="Times New Roman" w:hAnsi="Times New Roman" w:cs="Times New Roman"/>
-        </w:rPr>
-        <w:t xml:space="preserve">: </w:t>
-      </w:r>
-      <w:r>
-        <w:rPr>
-          <w:rFonts w:ascii="Times New Roman" w:hAnsi="Times New Roman" w:cs="Times New Roman"/>
-          <w:b/>
-          <w:bCs/>
-        </w:rPr>
-        <w:t xml:space="preserve">2 of 16</w:t>
-      </w:r>
-    </w:p>
-    <w:p>
-      <w:pPr>
-        <w:rPr>
-          <w:rFonts w:ascii="Times New Roman" w:hAnsi="Times New Roman" w:cs="Times New Roman"/>
-        </w:rPr>
-      </w:pPr>
-      <w:r>
-        <w:rPr>
-          <w:rFonts w:ascii="Times New Roman" w:hAnsi="Times New Roman" w:cs="Times New Roman"/>
-          <w:b/>
-          <w:bCs/>
-        </w:rPr>
-        <w:t xml:space="preserve">Status: on track</w:t>
+        <w:t>Status: on track</w:t>
       </w:r>
     </w:p>
     <w:p>
@@ -216,176 +186,177 @@
         <w:rPr>
           <w:rFonts w:ascii="Times New Roman" w:hAnsi="Times New Roman" w:cs="Times New Roman"/>
         </w:rPr>
-        <w:t xml:space="preserve">- Present the Week 1 shortlist and feasibility matrix at Review 1 and obtain guide approval for the selected anchor paper.</w:t>
-      </w:r>
-    </w:p>
-    <w:p>
-      <w:pPr>
-        <w:rPr>
-          <w:rFonts w:ascii="Times New Roman" w:hAnsi="Times New Roman" w:cs="Times New Roman"/>
-        </w:rPr>
-      </w:pPr>
-      <w:r>
-        <w:rPr>
-          <w:rFonts w:ascii="Times New Roman" w:hAnsi="Times New Roman" w:cs="Times New Roman"/>
-        </w:rPr>
-        <w:t xml:space="preserve">- Create the public GitHub repository and add the supervisor as a collaborator.</w:t>
-      </w:r>
-    </w:p>
-    <w:p>
-      <w:pPr>
-        <w:rPr>
-          <w:rFonts w:ascii="Times New Roman" w:hAnsi="Times New Roman" w:cs="Times New Roman"/>
-        </w:rPr>
-      </w:pPr>
-      <w:r>
-        <w:rPr>
-          <w:rFonts w:ascii="Times New Roman" w:hAnsi="Times New Roman" w:cs="Times New Roman"/>
-        </w:rPr>
-        <w:t xml:space="preserve">- Download the Spider benchmark dataset from Hugging Face Datasets.</w:t>
-      </w:r>
-    </w:p>
-    <w:p>
-      <w:pPr>
-        <w:rPr>
-          <w:rFonts w:ascii="Times New Roman" w:hAnsi="Times New Roman" w:cs="Times New Roman"/>
-        </w:rPr>
-      </w:pPr>
-      <w:r>
-        <w:rPr>
-          <w:rFonts w:ascii="Times New Roman" w:hAnsi="Times New Roman" w:cs="Times New Roman"/>
-        </w:rPr>
-        <w:t xml:space="preserve">- Clone the official CodeS repository and review its documented reproduction procedure.</w:t>
-      </w:r>
-    </w:p>
-    <w:p>
-      <w:pPr>
-        <w:rPr>
-          <w:rFonts w:ascii="Times New Roman" w:hAnsi="Times New Roman" w:cs="Times New Roman"/>
-        </w:rPr>
-      </w:pPr>
-      <w:r>
-        <w:rPr>
-          <w:rFonts w:ascii="Times New Roman" w:hAnsi="Times New Roman" w:cs="Times New Roman"/>
-        </w:rPr>
-        <w:t xml:space="preserve">What I actually did:</w:t>
-      </w:r>
-    </w:p>
-    <w:p>
-      <w:pPr>
-        <w:rPr>
-          <w:rFonts w:ascii="Times New Roman" w:hAnsi="Times New Roman" w:cs="Times New Roman"/>
-        </w:rPr>
-      </w:pPr>
-      <w:r>
-        <w:rPr>
-          <w:rFonts w:ascii="Times New Roman" w:hAnsi="Times New Roman" w:cs="Times New Roman"/>
-        </w:rPr>
-        <w:t xml:space="preserve">- Presented the project topic, literature review and feasibility matrix at Review 1. CodeS (SIGMOD 2024, arXiv:2402.16347) confirmed as the anchor paper, with RESDSQL (AAAI 2023) retained as the fallback.</w:t>
-      </w:r>
-    </w:p>
-    <w:p>
-      <w:pPr>
-        <w:rPr>
-          <w:rFonts w:ascii="Times New Roman" w:hAnsi="Times New Roman" w:cs="Times New Roman"/>
-        </w:rPr>
-      </w:pPr>
-      <w:r>
-        <w:rPr>
-          <w:rFonts w:ascii="Times New Roman" w:hAnsi="Times New Roman" w:cs="Times New Roman"/>
-        </w:rPr>
-        <w:t xml:space="preserve">- Reviewed the official reproduction instructions in the CodeS repository (https://github.com/RUCKBReasoning/codes) in detail.</w:t>
-      </w:r>
-    </w:p>
-    <w:p>
-      <w:pPr>
-        <w:rPr>
-          <w:rFonts w:ascii="Times New Roman" w:hAnsi="Times New Roman" w:cs="Times New Roman"/>
-        </w:rPr>
-      </w:pPr>
-      <w:r>
-        <w:rPr>
-          <w:rFonts w:ascii="Times New Roman" w:hAnsi="Times New Roman" w:cs="Times New Roman"/>
-        </w:rPr>
-        <w:t xml:space="preserve">- Recorded the exact environment specified by the authors: Python 3.8.5, PyTorch 1.13.1, transformers 4.28.1, pyserini 0.21.0 (requires Java 11), and a SimCSE build installed from a project-specific fork.</w:t>
-      </w:r>
-    </w:p>
-    <w:p>
-      <w:pPr>
-        <w:rPr>
-          <w:rFonts w:ascii="Times New Roman" w:hAnsi="Times New Roman" w:cs="Times New Roman"/>
-        </w:rPr>
-      </w:pPr>
-      <w:r>
-        <w:rPr>
-          <w:rFonts w:ascii="Times New Roman" w:hAnsi="Times New Roman" w:cs="Times New Roman"/>
-        </w:rPr>
-        <w:t xml:space="preserve">- Identified an environment risk: several dependency versions pinned by the repository are incompatible with current default Python runtimes, so an isolated Python 3.8.5 environment is required.</w:t>
-      </w:r>
-    </w:p>
-    <w:p>
-      <w:pPr>
-        <w:rPr>
-          <w:rFonts w:ascii="Times New Roman" w:hAnsi="Times New Roman" w:cs="Times New Roman"/>
-        </w:rPr>
-      </w:pPr>
-      <w:r>
-        <w:rPr>
-          <w:rFonts w:ascii="Times New Roman" w:hAnsi="Times New Roman" w:cs="Times New Roman"/>
-        </w:rPr>
-        <w:t xml:space="preserve">- Confirmed the locations of all required artefacts: model weights on Hugging Face (seeklhy/codes-1b through codes-15b), and the preprocessed data, schema item classifier checkpoints and Spider evaluation scripts distributed as separate archives by the authors.</w:t>
-      </w:r>
-    </w:p>
-    <w:p>
-      <w:pPr>
-        <w:rPr>
-          <w:rFonts w:ascii="Times New Roman" w:hAnsi="Times New Roman" w:cs="Times New Roman"/>
-        </w:rPr>
-      </w:pPr>
-      <w:r>
-        <w:rPr>
-          <w:rFonts w:ascii="Times New Roman" w:hAnsi="Times New Roman" w:cs="Times New Roman"/>
-        </w:rPr>
-        <w:t xml:space="preserve">- Noted that the authors evaluated on 8 x NVIDIA A800 80GB GPUs, and planned to reproduce using the smallest scale (CodeS-1B) so that inference is feasible on a single available GPU.</w:t>
-      </w:r>
-    </w:p>
-    <w:p>
-      <w:pPr>
-        <w:rPr>
-          <w:rFonts w:ascii="Times New Roman" w:hAnsi="Times New Roman" w:cs="Times New Roman"/>
-        </w:rPr>
-      </w:pPr>
-      <w:r>
-        <w:rPr>
-          <w:rFonts w:ascii="Times New Roman" w:hAnsi="Times New Roman" w:cs="Times New Roman"/>
-        </w:rPr>
-        <w:t xml:space="preserve">- Prepared a two-tier execution plan to de-risk the Week 4 gate: Tier 1 loads the released CodeS-1B checkpoint and verifies SQL generation end-to-end; Tier 2 recreates the authors environment and runs their evaluation scripts on Spider.</w:t>
-      </w:r>
-    </w:p>
-    <w:p>
-      <w:pPr>
-        <w:rPr>
-          <w:rFonts w:ascii="Times New Roman" w:hAnsi="Times New Roman" w:cs="Times New Roman"/>
-        </w:rPr>
-      </w:pPr>
-      <w:r>
-        <w:rPr>
-          <w:rFonts w:ascii="Times New Roman" w:hAnsi="Times New Roman" w:cs="Times New Roman"/>
-        </w:rPr>
-        <w:t xml:space="preserve">- Authored a reproducible setup notebook implementing both tiers, including an environment capture cell and an automatic reproduction-log writer.</w:t>
-      </w:r>
-    </w:p>
-    <w:p>
-      <w:pPr>
-        <w:rPr>
-          <w:rFonts w:ascii="Times New Roman" w:hAnsi="Times New Roman" w:cs="Times New Roman"/>
-        </w:rPr>
-      </w:pPr>
-      <w:r>
-        <w:rPr>
-          <w:rFonts w:ascii="Times New Roman" w:hAnsi="Times New Roman" w:cs="Times New Roman"/>
-        </w:rPr>
-        <w:t xml:space="preserve">- Defined the reproduction log schema required at Week 5 (run identifier, metric, runtime, random seed, GPU, library versions and notes).</w:t>
+        <w:t>- Present the Week 1 shortlist and feasibility matrix at Review 1 and obtain guide approval for the selected anchor paper.</w:t>
+      </w:r>
+    </w:p>
+    <w:p>
+      <w:pPr>
+        <w:rPr>
+          <w:rFonts w:ascii="Times New Roman" w:hAnsi="Times New Roman" w:cs="Times New Roman"/>
+        </w:rPr>
+      </w:pPr>
+      <w:r>
+        <w:rPr>
+          <w:rFonts w:ascii="Times New Roman" w:hAnsi="Times New Roman" w:cs="Times New Roman"/>
+        </w:rPr>
+        <w:t>- Create the public GitHub repository and add the supervisor as a collaborator.</w:t>
+      </w:r>
+    </w:p>
+    <w:p>
+      <w:pPr>
+        <w:rPr>
+          <w:rFonts w:ascii="Times New Roman" w:hAnsi="Times New Roman" w:cs="Times New Roman"/>
+        </w:rPr>
+      </w:pPr>
+      <w:r>
+        <w:rPr>
+          <w:rFonts w:ascii="Times New Roman" w:hAnsi="Times New Roman" w:cs="Times New Roman"/>
+        </w:rPr>
+        <w:t>- Download the Spider benchmark dataset from Hugging Face Datasets.</w:t>
+      </w:r>
+    </w:p>
+    <w:p>
+      <w:pPr>
+        <w:rPr>
+          <w:rFonts w:ascii="Times New Roman" w:hAnsi="Times New Roman" w:cs="Times New Roman"/>
+        </w:rPr>
+      </w:pPr>
+      <w:r>
+        <w:rPr>
+          <w:rFonts w:ascii="Times New Roman" w:hAnsi="Times New Roman" w:cs="Times New Roman"/>
+        </w:rPr>
+        <w:t>- Clone the official CodeS repository and review its documented reproduction procedure.</w:t>
+      </w:r>
+    </w:p>
+    <w:p>
+      <w:pPr>
+        <w:rPr>
+          <w:rFonts w:ascii="Times New Roman" w:hAnsi="Times New Roman" w:cs="Times New Roman"/>
+        </w:rPr>
+      </w:pPr>
+      <w:r>
+        <w:rPr>
+          <w:rFonts w:ascii="Times New Roman" w:hAnsi="Times New Roman" w:cs="Times New Roman"/>
+        </w:rPr>
+        <w:t>What I actually did:</w:t>
+      </w:r>
+    </w:p>
+    <w:p>
+      <w:pPr>
+        <w:rPr>
+          <w:rFonts w:ascii="Times New Roman" w:hAnsi="Times New Roman" w:cs="Times New Roman"/>
+        </w:rPr>
+      </w:pPr>
+      <w:r>
+        <w:rPr>
+          <w:rFonts w:ascii="Times New Roman" w:hAnsi="Times New Roman" w:cs="Times New Roman"/>
+        </w:rPr>
+        <w:t>- Presented the project topic, literature review and feasibility matrix at Review 1. CodeS (SIGMOD 2024, arXiv:2402.16347) confirmed as the anchor paper, with RESDSQL (AAAI 2023) retained as the fallback.</w:t>
+      </w:r>
+    </w:p>
+    <w:p>
+      <w:pPr>
+        <w:rPr>
+          <w:rFonts w:ascii="Times New Roman" w:hAnsi="Times New Roman" w:cs="Times New Roman"/>
+        </w:rPr>
+      </w:pPr>
+      <w:r>
+        <w:rPr>
+          <w:rFonts w:ascii="Times New Roman" w:hAnsi="Times New Roman" w:cs="Times New Roman"/>
+        </w:rPr>
+        <w:t>- Reviewed the official reproduction instructions in the CodeS repository (https://github.com/RUCKBReasoning/codes) in detail.</w:t>
+      </w:r>
+    </w:p>
+    <w:p>
+      <w:pPr>
+        <w:rPr>
+          <w:rFonts w:ascii="Times New Roman" w:hAnsi="Times New Roman" w:cs="Times New Roman"/>
+        </w:rPr>
+      </w:pPr>
+      <w:r>
+        <w:rPr>
+          <w:rFonts w:ascii="Times New Roman" w:hAnsi="Times New Roman" w:cs="Times New Roman"/>
+        </w:rPr>
+        <w:t>- Recorded the exact environment specified by the authors: Python 3.8.5, PyTorch 1.13.1, transformers 4.28.1, pyserini 0.21.0 (requires Java 11), and a SimCSE build installed from a project-specific fork.</w:t>
+      </w:r>
+    </w:p>
+    <w:p>
+      <w:pPr>
+        <w:rPr>
+          <w:rFonts w:ascii="Times New Roman" w:hAnsi="Times New Roman" w:cs="Times New Roman"/>
+        </w:rPr>
+      </w:pPr>
+      <w:r>
+        <w:rPr>
+          <w:rFonts w:ascii="Times New Roman" w:hAnsi="Times New Roman" w:cs="Times New Roman"/>
+        </w:rPr>
+        <w:t>- Identified an environment risk: several dependency versions pinned by the repository are incompatible with current default Python runtimes, so an isolated Python 3.8.5 environment is required.</w:t>
+      </w:r>
+    </w:p>
+    <w:p>
+      <w:pPr>
+        <w:rPr>
+          <w:rFonts w:ascii="Times New Roman" w:hAnsi="Times New Roman" w:cs="Times New Roman"/>
+        </w:rPr>
+      </w:pPr>
+      <w:r>
+        <w:rPr>
+          <w:rFonts w:ascii="Times New Roman" w:hAnsi="Times New Roman" w:cs="Times New Roman"/>
+        </w:rPr>
+        <w:t>- Confirmed the locations of all required artefacts: model weights on Hugging Face (seeklhy/codes-1b through codes-15b), and the preprocessed data, schema item classifier checkpoints and Spider evaluation scripts distributed as separate archives by the authors.</w:t>
+      </w:r>
+    </w:p>
+    <w:p>
+      <w:pPr>
+        <w:rPr>
+          <w:rFonts w:ascii="Times New Roman" w:hAnsi="Times New Roman" w:cs="Times New Roman"/>
+        </w:rPr>
+      </w:pPr>
+      <w:r>
+        <w:rPr>
+          <w:rFonts w:ascii="Times New Roman" w:hAnsi="Times New Roman" w:cs="Times New Roman"/>
+        </w:rPr>
+        <w:lastRenderedPageBreak/>
+        <w:t>- Noted that the authors evaluated on 8 x NVIDIA A800 80GB GPUs, and planned to reproduce using the smallest scale (CodeS-1B) so that inference is feasible on a single available GPU.</w:t>
+      </w:r>
+    </w:p>
+    <w:p>
+      <w:pPr>
+        <w:rPr>
+          <w:rFonts w:ascii="Times New Roman" w:hAnsi="Times New Roman" w:cs="Times New Roman"/>
+        </w:rPr>
+      </w:pPr>
+      <w:r>
+        <w:rPr>
+          <w:rFonts w:ascii="Times New Roman" w:hAnsi="Times New Roman" w:cs="Times New Roman"/>
+        </w:rPr>
+        <w:t>- Prepared a two-tier execution plan to de-risk the Week 4 gate: Tier 1 loads the released CodeS-1B checkpoint and verifies SQL generation end-to-end; Tier 2 recreates the authors environment and runs their evaluation scripts on Spider.</w:t>
+      </w:r>
+    </w:p>
+    <w:p>
+      <w:pPr>
+        <w:rPr>
+          <w:rFonts w:ascii="Times New Roman" w:hAnsi="Times New Roman" w:cs="Times New Roman"/>
+        </w:rPr>
+      </w:pPr>
+      <w:r>
+        <w:rPr>
+          <w:rFonts w:ascii="Times New Roman" w:hAnsi="Times New Roman" w:cs="Times New Roman"/>
+        </w:rPr>
+        <w:t>- Authored a reproducible setup notebook implementing both tiers, including an environment capture cell and an automatic reproduction-log writer.</w:t>
+      </w:r>
+    </w:p>
+    <w:p>
+      <w:pPr>
+        <w:rPr>
+          <w:rFonts w:ascii="Times New Roman" w:hAnsi="Times New Roman" w:cs="Times New Roman"/>
+        </w:rPr>
+      </w:pPr>
+      <w:r>
+        <w:rPr>
+          <w:rFonts w:ascii="Times New Roman" w:hAnsi="Times New Roman" w:cs="Times New Roman"/>
+        </w:rPr>
+        <w:t>- Defined the reproduction log schema required at Week 5 (run identifier, metric, runtime, random seed, GPU, library versions and notes).</w:t>
       </w:r>
     </w:p>
     <w:p>
@@ -411,33 +382,33 @@
         <w:rPr>
           <w:rFonts w:ascii="Times New Roman" w:hAnsi="Times New Roman" w:cs="Times New Roman"/>
         </w:rPr>
-        <w:t xml:space="preserve">- Paper's reported: N/A (reproduction begins once the environment is verified)</w:t>
-      </w:r>
-    </w:p>
-    <w:p>
-      <w:pPr>
-        <w:rPr>
-          <w:rFonts w:ascii="Times New Roman" w:hAnsi="Times New Roman" w:cs="Times New Roman"/>
-        </w:rPr>
-      </w:pPr>
-      <w:r>
-        <w:rPr>
-          <w:rFonts w:ascii="Times New Roman" w:hAnsi="Times New Roman" w:cs="Times New Roman"/>
-        </w:rPr>
-        <w:t xml:space="preserve">- My reproducibility: N/A (environment setup stage)</w:t>
-      </w:r>
-    </w:p>
-    <w:p>
-      <w:pPr>
-        <w:rPr>
-          <w:rFonts w:ascii="Times New Roman" w:hAnsi="Times New Roman" w:cs="Times New Roman"/>
-        </w:rPr>
-      </w:pPr>
-      <w:r>
-        <w:rPr>
-          <w:rFonts w:ascii="Times New Roman" w:hAnsi="Times New Roman" w:cs="Times New Roman"/>
-        </w:rPr>
-        <w:t xml:space="preserve">- Difference: N/A</w:t>
+        <w:t>- Paper's reported: N/A (reproduction begins once the environment is verified)</w:t>
+      </w:r>
+    </w:p>
+    <w:p>
+      <w:pPr>
+        <w:rPr>
+          <w:rFonts w:ascii="Times New Roman" w:hAnsi="Times New Roman" w:cs="Times New Roman"/>
+        </w:rPr>
+      </w:pPr>
+      <w:r>
+        <w:rPr>
+          <w:rFonts w:ascii="Times New Roman" w:hAnsi="Times New Roman" w:cs="Times New Roman"/>
+        </w:rPr>
+        <w:t>- My reproducibility: N/A (environment setup stage)</w:t>
+      </w:r>
+    </w:p>
+    <w:p>
+      <w:pPr>
+        <w:rPr>
+          <w:rFonts w:ascii="Times New Roman" w:hAnsi="Times New Roman" w:cs="Times New Roman"/>
+        </w:rPr>
+      </w:pPr>
+      <w:r>
+        <w:rPr>
+          <w:rFonts w:ascii="Times New Roman" w:hAnsi="Times New Roman" w:cs="Times New Roman"/>
+        </w:rPr>
+        <w:t>- Difference: N/A</w:t>
       </w:r>
     </w:p>
     <w:p>
@@ -463,20 +434,20 @@
         <w:rPr>
           <w:rFonts w:ascii="Times New Roman" w:hAnsi="Times New Roman" w:cs="Times New Roman"/>
         </w:rPr>
-        <w:t xml:space="preserve">- Dependency versions pinned by the anchor repository are older than current default runtimes; mitigated by provisioning an isolated Python 3.8.5 environment.</w:t>
-      </w:r>
-    </w:p>
-    <w:p>
-      <w:pPr>
-        <w:rPr>
-          <w:rFonts w:ascii="Times New Roman" w:hAnsi="Times New Roman" w:cs="Times New Roman"/>
-        </w:rPr>
-      </w:pPr>
-      <w:r>
-        <w:rPr>
-          <w:rFonts w:ascii="Times New Roman" w:hAnsi="Times New Roman" w:cs="Times New Roman"/>
-        </w:rPr>
-        <w:t xml:space="preserve">- Supporting archives are distributed via a file-sharing link that applies download rate limits; a manual download path has been prepared as a fallback.</w:t>
+        <w:t>- Dependency versions pinned by the anchor repository are older than current default runtimes; mitigated by provisioning an isolated Python 3.8.5 environment.</w:t>
+      </w:r>
+    </w:p>
+    <w:p>
+      <w:pPr>
+        <w:rPr>
+          <w:rFonts w:ascii="Times New Roman" w:hAnsi="Times New Roman" w:cs="Times New Roman"/>
+        </w:rPr>
+      </w:pPr>
+      <w:r>
+        <w:rPr>
+          <w:rFonts w:ascii="Times New Roman" w:hAnsi="Times New Roman" w:cs="Times New Roman"/>
+        </w:rPr>
+        <w:t>- Supporting archives are distributed via a file-sharing link that applies download rate limits; a manual download path has been prepared as a fallback.</w:t>
       </w:r>
     </w:p>
     <w:p>
@@ -506,7 +477,7 @@
         <w:rPr>
           <w:rFonts w:ascii="Times New Roman" w:hAnsi="Times New Roman" w:cs="Times New Roman"/>
         </w:rPr>
-        <w:t xml:space="preserve">- Execute Tier 1 of the setup notebook and confirm that the released model generates executable SQL (Week 4 red-flag gate).</w:t>
+        <w:t>Execute Tier 1 of the setup notebook and confirm that the released model generates executable SQL (Week 4 red-flag gate).</w:t>
       </w:r>
     </w:p>
     <w:p>
@@ -523,7 +494,7 @@
         <w:rPr>
           <w:rFonts w:ascii="Times New Roman" w:hAnsi="Times New Roman" w:cs="Times New Roman"/>
         </w:rPr>
-        <w:t xml:space="preserve">- Complete the Python 3.8.5 environment build and install all pinned dependencies.</w:t>
+        <w:t>Complete the Python 3.8.5 environment build and install all pinned dependencies.</w:t>
       </w:r>
     </w:p>
     <w:p>
@@ -540,7 +511,7 @@
         <w:rPr>
           <w:rFonts w:ascii="Times New Roman" w:hAnsi="Times New Roman" w:cs="Times New Roman"/>
         </w:rPr>
-        <w:t xml:space="preserve">- Download and extract the preprocessed data, schema item classifier checkpoints and evaluation scripts.</w:t>
+        <w:t>Download and extract the preprocessed data, schema item classifier checkpoints and evaluation scripts.</w:t>
       </w:r>
     </w:p>
     <w:p>
@@ -557,7 +528,7 @@
         <w:rPr>
           <w:rFonts w:ascii="Times New Roman" w:hAnsi="Times New Roman" w:cs="Times New Roman"/>
         </w:rPr>
-        <w:t xml:space="preserve">- Begin section-by-section annotation of the CodeS paper, identifying inputs, outputs, key equations and hyperparameters.</w:t>
+        <w:t>Begin section-by-section annotation of the CodeS paper, identifying inputs, outputs, key equations and hyperparameters.</w:t>
       </w:r>
     </w:p>
     <w:p>
@@ -574,15 +545,11 @@
         <w:rPr>
           <w:rFonts w:ascii="Times New Roman" w:hAnsi="Times New Roman" w:cs="Times New Roman"/>
         </w:rPr>
-        <w:t xml:space="preserve">- Produce the algorithm and architecture flowchart for the Week 3 deliverable.</w:t>
-      </w:r>
-    </w:p>
-    <w:p>
-      <w:pPr>
-        <w:numPr>
-          <w:ilvl w:val="0"/>
-          <w:numId w:val="1"/>
-        </w:numPr>
+        <w:t>Produce the algorithm and architecture flowchart for the Week 3 deliverable.</w:t>
+      </w:r>
+    </w:p>
+    <w:p>
+      <w:pPr>
         <w:rPr>
           <w:rFonts w:ascii="Times New Roman" w:hAnsi="Times New Roman" w:cs="Times New Roman"/>
         </w:rPr>

</xml_diff>